<commit_message>
Record the 1.1.8 portable package in the review response
Section 7 of the response letter and REVIEW_RESPONSE.md now describe the
portable package as built and tested (restricted-token launches, full CLI
example with a fixed seed), note the pixi.toml change to the OpenBLAS
builds of BLAS/LAPACK, and record how the pixi-based packaging differed
from the vcxproj procedure. The createdmg.sh row now says 1.1.8.
Regenerated the letter's .pdf (MiKTeX) and .docx.

Co-Authored-By: Claude Opus 5.5 <noreply@anthropic.com>
</commit_message>
<xml_diff>
--- a/docs/review/response-letter/SedSAT3_code_review_response.docx
+++ b/docs/review/response-letter/SedSAT3_code_review_response.docx
@@ -85,7 +85,7 @@
         <w:pStyle w:val="Line"/>
       </w:pPr>
       <w:r>
-        <w:t xml:space="preserve">October 19, 2026</w:t>
+        <w:t xml:space="preserve">October 20, 2026</w:t>
       </w:r>
     </w:p>
     <w:p>
@@ -5152,7 +5152,7 @@
         <w:t xml:space="preserve">run-app</w:t>
       </w:r>
       <w:r>
-        <w:t xml:space="preserve">. I have run every task on Windows 11 (Visual Studio 2022, MSVC v143, pixi 0.81, conda-forge Qt 6 and OpenBLAS), and none needed a change to </w:t>
+        <w:t xml:space="preserve">. I have run every task on Windows 11 (Visual Studio 2022, MSVC v143, pixi 0.81, conda-forge Qt 6 and OpenBLAS). Only one change to </w:t>
       </w:r>
       <w:r>
         <w:rPr>
@@ -5162,7 +5162,47 @@
         <w:t xml:space="preserve">pixi.toml</w:t>
       </w:r>
       <w:r>
-        <w:t xml:space="preserve">. </w:t>
+        <w:t xml:space="preserve"> was needed: on win-64 the solver chose the MKL builds of </w:t>
+      </w:r>
+      <w:r>
+        <w:rPr>
+          <w:rFonts w:ascii="Consolas" w:hAnsi="Consolas" w:cs="Consolas"/>
+          <w:sz w:val="19"/>
+        </w:rPr>
+        <w:t xml:space="preserve">libblas</w:t>
+      </w:r>
+      <w:r>
+        <w:t xml:space="preserve">, </w:t>
+      </w:r>
+      <w:r>
+        <w:rPr>
+          <w:rFonts w:ascii="Consolas" w:hAnsi="Consolas" w:cs="Consolas"/>
+          <w:sz w:val="19"/>
+        </w:rPr>
+        <w:t xml:space="preserve">libcblas</w:t>
+      </w:r>
+      <w:r>
+        <w:t xml:space="preserve"> and </w:t>
+      </w:r>
+      <w:r>
+        <w:rPr>
+          <w:rFonts w:ascii="Consolas" w:hAnsi="Consolas" w:cs="Consolas"/>
+          <w:sz w:val="19"/>
+        </w:rPr>
+        <w:t xml:space="preserve">liblapack</w:t>
+      </w:r>
+      <w:r>
+        <w:t xml:space="preserve">, whose </w:t>
+      </w:r>
+      <w:r>
+        <w:rPr>
+          <w:rFonts w:ascii="Consolas" w:hAnsi="Consolas" w:cs="Consolas"/>
+          <w:sz w:val="19"/>
+        </w:rPr>
+        <w:t xml:space="preserve">libcblas</w:t>
+      </w:r>
+      <w:r>
+        <w:t xml:space="preserve"> forwards every call to MKL, which GSL would then load. The file now asks for their OpenBLAS builds, which leaves the results unchanged and keeps about 540\,MB of MKL out of the portable package. </w:t>
       </w:r>
       <w:r>
         <w:rPr>
@@ -5302,12 +5342,48 @@
         <w:t xml:space="preserve">log(0)</w:t>
       </w:r>
       <w:r>
-        <w:t xml:space="preserve"> in a function that has no callers. The Visual Studio project now compiles the vendored QCustomPlot instead of a copy outside the repository; it still links a prebuilt QXlsx library, which I will change to the submodule as the qmake and CMake builds already do. The portable, no-administrator Windows package (unzip and run) will be built from the merged code and sent to the reviewers.</w:t>
+        <w:t xml:space="preserve"> in a function that has no callers. The Visual Studio project now compiles the vendored QCustomPlot instead of a copy outside the repository; it still links a prebuilt QXlsx library, which I will change to the submodule as the qmake and CMake builds already do.</w:t>
       </w:r>
     </w:p>
     <w:p>
       <w:pPr/>
       <w:r>
+        <w:t xml:space="preserve">The portable, no-administrator Windows package, </w:t>
+      </w:r>
+      <w:r>
+        <w:rPr>
+          <w:rFonts w:ascii="Consolas" w:hAnsi="Consolas" w:cs="Consolas"/>
+          <w:sz w:val="19"/>
+        </w:rPr>
+        <w:t xml:space="preserve">SedSAT3-1.1.8-windows-x64-portable.zip</w:t>
+      </w:r>
+      <w:r>
+        <w:t xml:space="preserve"> (42\,MB), is built from this pixi build, following </w:t>
+      </w:r>
+      <w:r>
+        <w:rPr>
+          <w:rFonts w:ascii="Consolas" w:hAnsi="Consolas" w:cs="Consolas"/>
+          <w:sz w:val="19"/>
+        </w:rPr>
+        <w:t xml:space="preserve">docs/PACKAGE-Windows-Portable.md</w:t>
+      </w:r>
+      <w:r>
+        <w:t xml:space="preserve">. It contains the GUI, the command-line program and its manual, and the virtual mixture example. Every DLL the two programs need is in the package, with nothing resolving from outside it or </w:t>
+      </w:r>
+      <w:r>
+        <w:rPr>
+          <w:rFonts w:ascii="Consolas" w:hAnsi="Consolas" w:cs="Consolas"/>
+          <w:sz w:val="19"/>
+        </w:rPr>
+        <w:t xml:space="preserve">System32</w:t>
+      </w:r>
+      <w:r>
+        <w:t xml:space="preserve">. I checked it under a restricted (non-administrator) token: the GUI opened with no elevation prompt from a folder in the user profile, from a path containing spaces and from another drive letter, and the command-line program ran the full example, including the Bayesian batch. The example script fixes the random seed, so the README can list the exact results a reviewer should get, and a second run reproduced them exactly. (Version 1.1.7 was a package built before these fixes, so this one is numbered 1.1.8.)</w:t>
+      </w:r>
+    </w:p>
+    <w:p>
+      <w:pPr/>
+      <w:r>
         <w:rPr>
           <w:i/>
         </w:rPr>
@@ -5334,7 +5410,7 @@
         <w:t xml:space="preserve">/W4</w:t>
       </w:r>
       <w:r>
-        <w:t xml:space="preserve"> and cppcheck defects fixed.</w:t>
+        <w:t xml:space="preserve"> and cppcheck defects fixed; portable package 1.1.8 built and tested.</w:t>
       </w:r>
     </w:p>
     <w:p>
@@ -7821,7 +7897,7 @@
               <w:pStyle w:val="TableText"/>
             </w:pPr>
             <w:r>
-              <w:t xml:space="preserve">Updated to 1.1.7.</w:t>
+              <w:t xml:space="preserve">Updated; every build file now says 1.1.8.</w:t>
             </w:r>
           </w:p>
         </w:tc>

</xml_diff>

<commit_message>
Retake the remaining screenshots; faster MCMC progress window
- MCMC progress window: update the charts at most about 1000 times a run
  instead of after every step (a default run with the window took over ten
  minutes, now under one), and skip undefined points. Sampling unchanged.
- Raw-data plot: log axes span whole decades, so values within one decade
  get labels at both ends; linear axes get a margin.
- Batch file names: ": " becomes " - " (8_Convergence - split R-hat.txt).
- Manual: main window and progress window screenshots retaken; the batch
  folder, file and credible-interval pictures replaced by text from a real
  batch run of the example data; note on sample file sizes; the progress
  window's panels described correctly.
- Windows package instructions ship examples/SampleData.xlsx only.
- Domain review response and both letters' PDF/docx rebuilt.

Co-Authored-By: Claude Opus 5.5 <noreply@anthropic.com>
</commit_message>
<xml_diff>
--- a/docs/review/response-letter/SedSAT3_code_review_response.docx
+++ b/docs/review/response-letter/SedSAT3_code_review_response.docx
@@ -85,7 +85,7 @@
         <w:pStyle w:val="Line"/>
       </w:pPr>
       <w:r>
-        <w:t xml:space="preserve">October 20, 2026</w:t>
+        <w:t xml:space="preserve">October 23, 2026</w:t>
       </w:r>
     </w:p>
     <w:p>
@@ -165,7 +165,7 @@
         <w:t xml:space="preserve">review-fixes-oct2026</w:t>
       </w:r>
       <w:r>
-        <w:t xml:space="preserve">), organised as one commit per area so they can be reviewed separately:</w:t>
+        <w:t xml:space="preserve">), organized as one commit per area so they can be reviewed separately:</w:t>
       </w:r>
     </w:p>
     <w:tbl>
@@ -590,7 +590,7 @@
     <w:p>
       <w:pPr/>
       <w:r>
-        <w:t xml:space="preserve">Below, each of your comments is reproduced (quoted where short, summarised where long) and followed by my response. Comments are grouped by topic; the source of each is given at the right of its heading: </w:t>
+        <w:t xml:space="preserve">Below, each of your comments is reproduced (quoted where short, summarized where long) and followed by my response. Comments are grouped by topic; the source of each is given at the right of its heading: </w:t>
       </w:r>
       <w:r>
         <w:rPr>
@@ -2009,7 +2009,7 @@
         <w:t xml:space="preserve">Conductor::CheckNegativeElements</w:t>
       </w:r>
       <w:r>
-        <w:t xml:space="preserve"> (both overloads) — undefined behaviour, currently masked on MSVC.</w:t>
+        <w:t xml:space="preserve"> (both overloads) — undefined behavior, currently masked on MSVC.</w:t>
       </w:r>
     </w:p>
     <w:p>
@@ -2750,7 +2750,7 @@
         <w:shd w:val="clear" w:color="auto" w:fill="F2F5F8"/>
       </w:pPr>
       <w:r>
-        <w:t xml:space="preserve">Widespread uninitialised variables flagged by clang-tidy and cppcheck.</w:t>
+        <w:t xml:space="preserve">Widespread uninitialized variables flagged by clang-tidy and cppcheck.</w:t>
       </w:r>
     </w:p>
     <w:p>
@@ -2782,7 +2782,7 @@
         <w:t xml:space="preserve">cppcoreguidelines-pro-type-member-init</w:t>
       </w:r>
       <w:r>
-        <w:t xml:space="preserve"> were fixed: in-class initialisers for members, and NaN for floating-point locals so that any read-before-write is visible rather than silent. One was a real defect: the stepwise DFA could report an unassigned Wilks’ λ when no element improved the fit (it now reports NaN). These two checks are errors in the CI clang-tidy job, so new instances fail the pipeline.</w:t>
+        <w:t xml:space="preserve"> were fixed: in-class initializers for members, and NaN for floating-point locals so that any read-before-write is visible rather than silent. One was a real defect: the stepwise DFA could report an unassigned Wilks’ λ when no element improved the fit (it now reports NaN). These two checks are errors in the CI clang-tidy job, so new instances fail the pipeline.</w:t>
       </w:r>
     </w:p>
     <w:p>
@@ -3492,7 +3492,7 @@
         <w:t xml:space="preserve">parseNumericCell</w:t>
       </w:r>
       <w:r>
-        <w:t xml:space="preserve"> and overloads for spreadsheet and project-file values), used by the Excel import, project loading, the element table and the command line. It refuses empty cells, NaN / Inf / Infinity in any case, overflow, text, and decimal commas or thousands separators, each with a specific reason. A refused value stops the import with sheet, row, column and value (Excel) or group, sample and constituent (project file) — the same treatment empty and non-numeric cells already had, since SedSAT3 has no missing-data value. Two findings from tracing the behaviour you observed: the “Ignored NaN, Inf, or -Inf value” message came from Qt Charts while plotting, so the NaN </w:t>
+        <w:t xml:space="preserve"> and overloads for spreadsheet and project-file values), used by the Excel import, project loading, the element table and the command line. It refuses empty cells, NaN / Inf / Infinity in any case, overflow, text, and decimal commas or thousands separators, each with a specific reason. A refused value stops the import with sheet, row, column and value (Excel) or group, sample and constituent (project file) — the same treatment empty and non-numeric cells already had, since SedSAT3 has no missing-data value. Two findings from tracing the behavior you observed: the “Ignored NaN, Inf, or -Inf value” message came from Qt Charts while plotting, so the NaN </w:t>
       </w:r>
       <w:r>
         <w:rPr>
@@ -3511,7 +3511,7 @@
         <w:t xml:space="preserve">null</w:t>
       </w:r>
       <w:r>
-        <w:t xml:space="preserve">) into 0, and silently dropped a sample that failed to load. Both now stop the load with the location. The only ad-hoc data guard downstream (the Box–Cox optimiser’s </w:t>
+        <w:t xml:space="preserve">) into 0, and silently dropped a sample that failed to load. Both now stop the load with the location. The only ad-hoc data guard downstream (the Box–Cox optimizer’s </w:t>
       </w:r>
       <w:r>
         <w:rPr>
@@ -3779,7 +3779,7 @@
         <w:t xml:space="preserve">.gitlab-ci.yml</w:t>
       </w:r>
       <w:r>
-        <w:t xml:space="preserve"> builds with CMake (GUI, command line, tests), with the GA enabled, and with the qmake projects; runs the unit and regression tests; runs clang-tidy (initialisation checks as errors) and cppcheck; has a manual Windows job for a Windows runner; and publishes the Doxygen documentation to GitLab Pages. The existing GitHub documentation workflow is kept for the development mirror.</w:t>
+        <w:t xml:space="preserve"> builds with CMake (GUI, command line, tests), with the GA enabled, and with the qmake projects; runs the unit and regression tests; runs clang-tidy (initialization checks as errors) and cppcheck; has a manual Windows job for a Windows runner; and publishes the Doxygen documentation to GitLab Pages. The existing GitHub documentation workflow is kept for the development mirror.</w:t>
       </w:r>
     </w:p>
     <w:p>
@@ -4992,7 +4992,7 @@
         <w:t xml:space="preserve">.clang-tidy</w:t>
       </w:r>
       <w:r>
-        <w:t xml:space="preserve"> would replace the repository’s stricter one (which CI uses, with the initialisation and </w:t>
+        <w:t xml:space="preserve"> would replace the repository’s stricter one (which CI uses, with the initialization and </w:t>
       </w:r>
       <w:r>
         <w:rPr>
@@ -5262,7 +5262,7 @@
         <w:t xml:space="preserve">lint</w:t>
       </w:r>
       <w:r>
-        <w:t xml:space="preserve"> reports no errors and 10 warnings: three floating-point grid loops, each reported by two checks; two static initialisers that could throw; and two leaks on Qt-parented labels, which are false positives. The MSVC </w:t>
+        <w:t xml:space="preserve"> reports no errors and 10 warnings: three floating-point grid loops, each reported by two checks; two static initializers that could throw; and two leaks on Qt-parented labels, which are false positives. The MSVC </w:t>
       </w:r>
       <w:r>
         <w:rPr>
@@ -5322,7 +5322,7 @@
         <w:t xml:space="preserve">SourceSinkData::MCMC</w:t>
       </w:r>
       <w:r>
-        <w:t xml:space="preserve">, and an uninitialised </w:t>
+        <w:t xml:space="preserve">, and an uninitialized </w:t>
       </w:r>
       <w:r>
         <w:rPr>
@@ -7413,7 +7413,7 @@
               <w:t xml:space="preserve">Interface</w:t>
             </w:r>
             <w:r>
-              <w:t xml:space="preserve"> limits uninitialised; copy operations incomplete</w:t>
+              <w:t xml:space="preserve"> limits uninitialized; copy operations incomplete</w:t>
             </w:r>
           </w:p>
         </w:tc>
@@ -7426,7 +7426,7 @@
               <w:pStyle w:val="TableText"/>
             </w:pPr>
             <w:r>
-              <w:t xml:space="preserve">Fixed: members initialised, and the copy constructor and assignment now copy every member, so copies keep their notes (outlier and bracketing flags) and highlight limits.</w:t>
+              <w:t xml:space="preserve">Fixed: members initialized, and the copy constructor and assignment now copy every member, so copies keep their notes (outlier and bracketing flags) and highlight limits.</w:t>
             </w:r>
           </w:p>
         </w:tc>
@@ -7457,7 +7457,7 @@
               <w:pStyle w:val="TableText"/>
             </w:pPr>
             <w:r>
-              <w:t xml:space="preserve">Uninitialised members of </w:t>
+              <w:t xml:space="preserve">Uninitialized members of </w:t>
             </w:r>
             <w:r>
               <w:rPr>
@@ -8163,7 +8163,7 @@
         </w:numPr>
       </w:pPr>
       <w:r>
-        <w:t xml:space="preserve">An MCMC initialisation routine computed a step from -low - high instead of high - low.</w:t>
+        <w:t xml:space="preserve">An MCMC initialization routine computed a step from -low - high instead of high - low.</w:t>
       </w:r>
     </w:p>
     <w:p>
@@ -8520,7 +8520,7 @@
               <w:pStyle w:val="TableText"/>
             </w:pPr>
             <w:r>
-              <w:t xml:space="preserve">Fixed with in-class initialisers.</w:t>
+              <w:t xml:space="preserve">Fixed with in-class initializers.</w:t>
             </w:r>
           </w:p>
         </w:tc>
@@ -8900,7 +8900,7 @@
               <w:pStyle w:val="TableText"/>
             </w:pPr>
             <w:r>
-              <w:t xml:space="preserve">Fixed (initialisation, uniform curve).</w:t>
+              <w:t xml:space="preserve">Fixed (initialization, uniform curve).</w:t>
             </w:r>
           </w:p>
         </w:tc>
@@ -9634,7 +9634,7 @@
               <w:pStyle w:val="TableText"/>
             </w:pPr>
             <w:r>
-              <w:t xml:space="preserve">Now tested for both parameterisations: </w:t>
+              <w:t xml:space="preserve">Now tested for both parameterizations: </w:t>
             </w:r>
             <w:r>
               <w:rPr>

</xml_diff>

<commit_message>
Code review letter: regenerate the Word version
With the final package in Section 7, the manual no longer describing the GA,
and thin spaces converted.

Co-Authored-By: Claude Opus 5.5 <noreply@anthropic.com>
</commit_message>
<xml_diff>
--- a/docs/review/response-letter/SedSAT3_code_review_response.docx
+++ b/docs/review/response-letter/SedSAT3_code_review_response.docx
@@ -3284,7 +3284,7 @@
         <w:t xml:space="preserve">all</w:t>
       </w:r>
       <w:r>
-        <w:t xml:space="preserve"> chains, so 3000 samples with 8 chains is only 375 steps per chain; at 40\,000 samples with 20\,000 burn-in the validation targets in our test project are recovered at 85–99% to the correct source, in agreement with Levenberg–Marquardt. Now that runs are reproducible, sampling noise and non-convergence can at least be separated by re-running with the same seed and more samples. Exposing R-hat, effective sample size and trace plots is a feature I plan for a later version; whether the current defaults are adequate is for the domain review.</w:t>
+        <w:t xml:space="preserve"> chains, so 3000 samples with 8 chains is only 375 steps per chain; at 40 000 samples with 20 000 burn-in the validation targets in our test project are recovered at 85–99% to the correct source, in agreement with Levenberg–Marquardt. Now that runs are reproducible, sampling noise and non-convergence can at least be separated by re-running with the same seed and more samples. Exposing R-hat, effective sample size and trace plots is a feature I plan for a later version; whether the current defaults are adequate is for the domain review.</w:t>
       </w:r>
     </w:p>
     <w:p>
@@ -3924,7 +3924,7 @@
         <w:t xml:space="preserve">GA.h</w:t>
       </w:r>
       <w:r>
-        <w:t xml:space="preserve">. The README and code.json no longer list it as a method, the README says it is included but disabled and why, and the command-line program and its manual leave out its commands. The missing </w:t>
+        <w:t xml:space="preserve">. The README and code.json no longer list it as a method, the README says it is included but disabled and why, the user’s manual no longer describes it, and the command-line program and its manual leave out its commands. The missing </w:t>
       </w:r>
       <w:r>
         <w:rPr>
@@ -5202,7 +5202,7 @@
         <w:t xml:space="preserve">libcblas</w:t>
       </w:r>
       <w:r>
-        <w:t xml:space="preserve"> forwards every call to MKL, which GSL would then load. The file now asks for their OpenBLAS builds, which leaves the results unchanged and keeps about 540\,MB of MKL out of the portable package. </w:t>
+        <w:t xml:space="preserve"> forwards every call to MKL, which GSL would then load. The file now asks for their OpenBLAS builds, which leaves the results unchanged and keeps about 540 MB of MKL out of the portable package. </w:t>
       </w:r>
       <w:r>
         <w:rPr>
@@ -5388,7 +5388,17 @@
         <w:t xml:space="preserve">SampleData.xlsx</w:t>
       </w:r>
       <w:r>
-        <w:t xml:space="preserve">. Every DLL the two programs need is in the package, with nothing resolving from outside it or </w:t>
+        <w:t xml:space="preserve"> (with the same data saved as a project, </w:t>
+      </w:r>
+      <w:r>
+        <w:rPr>
+          <w:rFonts w:ascii="Consolas" w:hAnsi="Consolas" w:cs="Consolas"/>
+          <w:sz w:val="19"/>
+        </w:rPr>
+        <w:t xml:space="preserve">SampleData.cmb</w:t>
+      </w:r>
+      <w:r>
+        <w:t xml:space="preserve">, for the command-line example). Every DLL the two programs need is in the package, with nothing resolving from outside it or </w:t>
       </w:r>
       <w:r>
         <w:rPr>
@@ -5398,7 +5408,39 @@
         <w:t xml:space="preserve">System32</w:t>
       </w:r>
       <w:r>
-        <w:t xml:space="preserve">. Each build is checked under a restricted (non-administrator) token: the GUI opens with no elevation prompt from a folder in the user profile, from a path containing spaces and from another drive letter, and the command-line program runs a full example, including a Bayesian batch. The example script fixes the random seed, so the README lists the exact results a reviewer should get, and a second run reproduces them exactly. The package sent to the reviewers is built from the merged code.</w:t>
+        <w:t xml:space="preserve">. Each build is checked under a restricted (non-administrator) token: the GUI opens with no elevation prompt from a folder in the user profile, from a path containing spaces and from another drive letter, and the command-line program runs a full example, including a Bayesian batch. The example script fixes the random seed, so the README lists the exact results a reviewer should get, and a second run reproduces them exactly. The package for the reviewers, built on October 24 from </w:t>
+      </w:r>
+      <w:r>
+        <w:rPr>
+          <w:rFonts w:ascii="Consolas" w:hAnsi="Consolas" w:cs="Consolas"/>
+          <w:sz w:val="19"/>
+        </w:rPr>
+        <w:t xml:space="preserve">74d54a6</w:t>
+      </w:r>
+      <w:r>
+        <w:t xml:space="preserve">, is posted on merge request !4 (44 MB):</w:t>
+      </w:r>
+      <w:r>
+        <w:br/>
+      </w:r>
+      <w:r>
+        <w:t xml:space="preserve"> </w:t>
+      </w:r>
+      <w:r>
+        <w:t xml:space="preserve">https://code.usgs.gov/-/project/20102/uploads/a9642eb7c4f46c966d73c3225341d418/SedSAT3-1.1.8-windows-x64-portable.zip</w:t>
+      </w:r>
+      <w:r>
+        <w:br/>
+      </w:r>
+      <w:r>
+        <w:t xml:space="preserve"> SHA-256: </w:t>
+      </w:r>
+      <w:r>
+        <w:rPr>
+          <w:rFonts w:ascii="Consolas" w:hAnsi="Consolas" w:cs="Consolas"/>
+          <w:sz w:val="19"/>
+        </w:rPr>
+        <w:t xml:space="preserve">0cd424f93650ed42d7888ba8863f803b9af9ab31ceee38ee407ab9afce6056b3</w:t>
       </w:r>
     </w:p>
     <w:p>

</xml_diff>